<commit_message>
Trim Amendment I to addendum-only format
Removes restatement of TANIP-1 terms; now links to the original proposal
and describes only the zero-distribution bridge change and its rationale.

https://claude.ai/code/session_016mQ9whgNKKGDXRPfCYPFhA
</commit_message>
<xml_diff>
--- a/proposals/TANIP-1-Amendment-I.docx
+++ b/proposals/TANIP-1-Amendment-I.docx
@@ -11,7 +11,7 @@
           <w:rFonts w:ascii="Calibri" w:hAnsi="Calibri"/>
           <w:b/>
           <w:color w:val="1B3A6B"/>
-          <w:sz w:val="48"/>
+          <w:sz w:val="44"/>
         </w:rPr>
         <w:t>TANIP-1 Amendment I</w:t>
       </w:r>
@@ -23,10 +23,10 @@
       <w:r>
         <w:rPr>
           <w:rFonts w:ascii="Calibri" w:hAnsi="Calibri"/>
-          <w:color w:val="505050"/>
-          <w:sz w:val="28"/>
+          <w:color w:val="5A5A5A"/>
+          <w:sz w:val="26"/>
         </w:rPr>
-        <w:t>Resumption via Zero-Distribution Period Bridge</w:t>
+        <w:t>Zero-Distribution Period Bridge</w:t>
       </w:r>
     </w:p>
     <w:p/>
@@ -43,7 +43,7 @@
       <w:tr>
         <w:tc>
           <w:tcPr>
-            <w:tcW w:type="dxa" w:w="2268"/>
+            <w:tcW w:type="dxa" w:w="1984"/>
           </w:tcPr>
           <w:p>
             <w:r>
@@ -58,7 +58,7 @@
         </w:tc>
         <w:tc>
           <w:tcPr>
-            <w:tcW w:type="dxa" w:w="6803"/>
+            <w:tcW w:type="dxa" w:w="7087"/>
           </w:tcPr>
           <w:p>
             <w:r>
@@ -74,7 +74,7 @@
       <w:tr>
         <w:tc>
           <w:tcPr>
-            <w:tcW w:type="dxa" w:w="2268"/>
+            <w:tcW w:type="dxa" w:w="1984"/>
           </w:tcPr>
           <w:p>
             <w:r>
@@ -89,7 +89,7 @@
         </w:tc>
         <w:tc>
           <w:tcPr>
-            <w:tcW w:type="dxa" w:w="6803"/>
+            <w:tcW w:type="dxa" w:w="7087"/>
           </w:tcPr>
           <w:p>
             <w:r>
@@ -105,7 +105,7 @@
       <w:tr>
         <w:tc>
           <w:tcPr>
-            <w:tcW w:type="dxa" w:w="2268"/>
+            <w:tcW w:type="dxa" w:w="1984"/>
           </w:tcPr>
           <w:p>
             <w:r>
@@ -120,7 +120,7 @@
         </w:tc>
         <w:tc>
           <w:tcPr>
-            <w:tcW w:type="dxa" w:w="6803"/>
+            <w:tcW w:type="dxa" w:w="7087"/>
           </w:tcPr>
           <w:p>
             <w:r>
@@ -129,6 +129,8 @@
                 <w:sz w:val="20"/>
               </w:rPr>
               <w:t>TANIP-1 — Trading Fee Rebate Program</w:t>
+              <w:br/>
+              <w:t>https://forum.telcoin.org/t/tanip-trading-fee-rebate-program/824</w:t>
             </w:r>
           </w:p>
         </w:tc>
@@ -136,7 +138,7 @@
       <w:tr>
         <w:tc>
           <w:tcPr>
-            <w:tcW w:type="dxa" w:w="2268"/>
+            <w:tcW w:type="dxa" w:w="1984"/>
           </w:tcPr>
           <w:p>
             <w:r>
@@ -151,7 +153,7 @@
         </w:tc>
         <w:tc>
           <w:tcPr>
-            <w:tcW w:type="dxa" w:w="6803"/>
+            <w:tcW w:type="dxa" w:w="7087"/>
           </w:tcPr>
           <w:p>
             <w:r>
@@ -160,287 +162,6 @@
                 <w:sz w:val="20"/>
               </w:rPr>
               <w:t>April 2026</w:t>
-            </w:r>
-          </w:p>
-        </w:tc>
-      </w:tr>
-      <w:tr>
-        <w:tc>
-          <w:tcPr>
-            <w:tcW w:type="dxa" w:w="2268"/>
-          </w:tcPr>
-          <w:p>
-            <w:r>
-              <w:rPr>
-                <w:rFonts w:ascii="Calibri" w:hAnsi="Calibri"/>
-                <w:b/>
-                <w:sz w:val="20"/>
-              </w:rPr>
-              <w:t>Forum</w:t>
-            </w:r>
-          </w:p>
-        </w:tc>
-        <w:tc>
-          <w:tcPr>
-            <w:tcW w:type="dxa" w:w="6803"/>
-          </w:tcPr>
-          <w:p>
-            <w:r>
-              <w:rPr>
-                <w:rFonts w:ascii="Calibri" w:hAnsi="Calibri"/>
-                <w:sz w:val="20"/>
-              </w:rPr>
-              <w:t>https://forum.telcoin.org/t/tanip-trading-fee-rebate-program/824</w:t>
-            </w:r>
-          </w:p>
-        </w:tc>
-      </w:tr>
-    </w:tbl>
-    <w:p/>
-    <w:p/>
-    <w:p>
-      <w:pPr>
-        <w:pStyle w:val="Heading2"/>
-      </w:pPr>
-      <w:r>
-        <w:rPr>
-          <w:rFonts w:ascii="Calibri" w:hAnsi="Calibri"/>
-          <w:b/>
-          <w:color w:val="1B3A6B"/>
-          <w:sz w:val="28"/>
-        </w:rPr>
-        <w:t>1. Summary</w:t>
-      </w:r>
-    </w:p>
-    <w:p>
-      <w:pPr>
-        <w:spacing w:after="120"/>
-      </w:pPr>
-      <w:r>
-        <w:t>This amendment proposes resuming TANIP-1 using the existing smart contracts, bridging the paused period by inserting zero-distribution entries for the weeks in which the program was inactive. This preserves all users' earned reward histories and avoids any need to redeploy contracts or migrate state.</w:t>
-      </w:r>
-    </w:p>
-    <w:p>
-      <w:pPr>
-        <w:pStyle w:val="Heading2"/>
-      </w:pPr>
-      <w:r>
-        <w:rPr>
-          <w:rFonts w:ascii="Calibri" w:hAnsi="Calibri"/>
-          <w:b/>
-          <w:color w:val="1B3A6B"/>
-          <w:sz w:val="28"/>
-        </w:rPr>
-        <w:t>2. Background</w:t>
-      </w:r>
-    </w:p>
-    <w:p>
-      <w:pPr>
-        <w:spacing w:after="120"/>
-      </w:pPr>
-      <w:r>
-        <w:t>TANIP-1 (the Trading Fee Rebate Program) was paused approximately 16 weeks ago. During the pause, no weekly allocations were distributed, resulting in an estimated budget saving of ~51.2M TEL (16 weeks × 3,205,128.205 TEL).</w:t>
-      </w:r>
-    </w:p>
-    <w:p>
-      <w:pPr>
-        <w:spacing w:after="120"/>
-      </w:pPr>
-      <w:r>
-        <w:t>The on-chain calculator contract and off-chain distribution script track cumulative user balances — specifically each user's total earned amount — across sequential weekly periods. When the program resumes, the calculator must be brought up to date with the current week before any new distributions can be processed. Without an explicit bridging mechanism, the contract's internal period index falls behind real time, which could corrupt future reward calculations.</w:t>
-      </w:r>
-    </w:p>
-    <w:p>
-      <w:pPr>
-        <w:pStyle w:val="Heading2"/>
-      </w:pPr>
-      <w:r>
-        <w:rPr>
-          <w:rFonts w:ascii="Calibri" w:hAnsi="Calibri"/>
-          <w:b/>
-          <w:color w:val="1B3A6B"/>
-          <w:sz w:val="28"/>
-        </w:rPr>
-        <w:t>3. Problem Statement</w:t>
-      </w:r>
-    </w:p>
-    <w:p>
-      <w:pPr>
-        <w:spacing w:after="120"/>
-      </w:pPr>
-      <w:r>
-        <w:t>The calculator contract processes distributions period by period. Because the program was paused mid-sequence, the contract's period index no longer reflects the current week. Simply resuming distributions without addressing the gap would cause the contract to apply new distribution data against stale period state, potentially miscalculating users' time-weighted stakes and earned totals.</w:t>
-      </w:r>
-    </w:p>
-    <w:p>
-      <w:pPr>
-        <w:spacing w:after="120"/>
-      </w:pPr>
-      <w:r>
-        <w:t>Two approaches were considered:</w:t>
-      </w:r>
-    </w:p>
-    <w:tbl>
-      <w:tblPr>
-        <w:tblStyle w:val="TableGrid"/>
-        <w:tblW w:type="auto" w:w="0"/>
-        <w:jc w:val="left"/>
-        <w:tblLook w:firstColumn="1" w:firstRow="1" w:lastColumn="0" w:lastRow="0" w:noHBand="0" w:noVBand="1" w:val="04A0"/>
-      </w:tblPr>
-      <w:tblGrid>
-        <w:gridCol w:w="3022"/>
-        <w:gridCol w:w="3022"/>
-        <w:gridCol w:w="3022"/>
-      </w:tblGrid>
-      <w:tr>
-        <w:tc>
-          <w:tcPr>
-            <w:tcW w:type="dxa" w:w="3118"/>
-            <w:shd w:val="clear" w:color="auto" w:fill="1B3A6B"/>
-          </w:tcPr>
-          <w:p>
-            <w:r/>
-            <w:r>
-              <w:rPr>
-                <w:rFonts w:ascii="Calibri" w:hAnsi="Calibri"/>
-                <w:b/>
-                <w:color w:val="FFFFFF"/>
-                <w:sz w:val="20"/>
-              </w:rPr>
-              <w:t>Approach</w:t>
-            </w:r>
-          </w:p>
-        </w:tc>
-        <w:tc>
-          <w:tcPr>
-            <w:tcW w:type="dxa" w:w="2551"/>
-            <w:shd w:val="clear" w:color="auto" w:fill="1B3A6B"/>
-          </w:tcPr>
-          <w:p>
-            <w:r/>
-            <w:r>
-              <w:rPr>
-                <w:rFonts w:ascii="Calibri" w:hAnsi="Calibri"/>
-                <w:b/>
-                <w:color w:val="FFFFFF"/>
-                <w:sz w:val="20"/>
-              </w:rPr>
-              <w:t>Pros</w:t>
-            </w:r>
-          </w:p>
-        </w:tc>
-        <w:tc>
-          <w:tcPr>
-            <w:tcW w:type="dxa" w:w="3402"/>
-            <w:shd w:val="clear" w:color="auto" w:fill="1B3A6B"/>
-          </w:tcPr>
-          <w:p>
-            <w:r/>
-            <w:r>
-              <w:rPr>
-                <w:rFonts w:ascii="Calibri" w:hAnsi="Calibri"/>
-                <w:b/>
-                <w:color w:val="FFFFFF"/>
-                <w:sz w:val="20"/>
-              </w:rPr>
-              <w:t>Cons</w:t>
-            </w:r>
-          </w:p>
-        </w:tc>
-      </w:tr>
-      <w:tr>
-        <w:tc>
-          <w:tcPr>
-            <w:tcW w:type="dxa" w:w="3118"/>
-          </w:tcPr>
-          <w:p>
-            <w:r/>
-            <w:r>
-              <w:rPr>
-                <w:rFonts w:ascii="Calibri" w:hAnsi="Calibri"/>
-                <w:sz w:val="20"/>
-              </w:rPr>
-              <w:t>A. Redeploy new contracts</w:t>
-            </w:r>
-          </w:p>
-        </w:tc>
-        <w:tc>
-          <w:tcPr>
-            <w:tcW w:type="dxa" w:w="2551"/>
-          </w:tcPr>
-          <w:p>
-            <w:r/>
-            <w:r>
-              <w:rPr>
-                <w:rFonts w:ascii="Calibri" w:hAnsi="Calibri"/>
-                <w:sz w:val="20"/>
-              </w:rPr>
-              <w:t>Clean slate</w:t>
-            </w:r>
-          </w:p>
-        </w:tc>
-        <w:tc>
-          <w:tcPr>
-            <w:tcW w:type="dxa" w:w="3402"/>
-          </w:tcPr>
-          <w:p>
-            <w:r/>
-            <w:r>
-              <w:rPr>
-                <w:rFonts w:ascii="Calibri" w:hAnsi="Calibri"/>
-                <w:sz w:val="20"/>
-              </w:rPr>
-              <w:t>Erases all users' earned history; requires migration</w:t>
-            </w:r>
-          </w:p>
-        </w:tc>
-      </w:tr>
-      <w:tr>
-        <w:tc>
-          <w:tcPr>
-            <w:tcW w:type="dxa" w:w="3118"/>
-            <w:shd w:val="clear" w:color="auto" w:fill="EEF2F7"/>
-          </w:tcPr>
-          <w:p>
-            <w:r/>
-            <w:r>
-              <w:rPr>
-                <w:rFonts w:ascii="Calibri" w:hAnsi="Calibri"/>
-                <w:sz w:val="20"/>
-              </w:rPr>
-              <w:t>B. Insert zero-distribution periods (this proposal)</w:t>
-            </w:r>
-          </w:p>
-        </w:tc>
-        <w:tc>
-          <w:tcPr>
-            <w:tcW w:type="dxa" w:w="2551"/>
-            <w:shd w:val="clear" w:color="auto" w:fill="EEF2F7"/>
-          </w:tcPr>
-          <w:p>
-            <w:r/>
-            <w:r>
-              <w:rPr>
-                <w:rFonts w:ascii="Calibri" w:hAnsi="Calibri"/>
-                <w:sz w:val="20"/>
-              </w:rPr>
-              <w:t>Preserves full user history</w:t>
-            </w:r>
-          </w:p>
-        </w:tc>
-        <w:tc>
-          <w:tcPr>
-            <w:tcW w:type="dxa" w:w="3402"/>
-            <w:shd w:val="clear" w:color="auto" w:fill="EEF2F7"/>
-          </w:tcPr>
-          <w:p>
-            <w:r/>
-            <w:r>
-              <w:rPr>
-                <w:rFonts w:ascii="Calibri" w:hAnsi="Calibri"/>
-                <w:sz w:val="20"/>
-              </w:rPr>
-              <w:t>Required testing to confirm contract accepts zero inputs</w:t>
             </w:r>
           </w:p>
         </w:tc>
@@ -456,91 +177,21 @@
           <w:rFonts w:ascii="Calibri" w:hAnsi="Calibri"/>
           <w:b/>
           <w:color w:val="1B3A6B"/>
-          <w:sz w:val="28"/>
+          <w:sz w:val="26"/>
         </w:rPr>
-        <w:t>4. Proposed Solution</w:t>
+        <w:t>Context</w:t>
       </w:r>
     </w:p>
     <w:p>
       <w:pPr>
-        <w:spacing w:after="120"/>
-      </w:pPr>
-      <w:r>
-        <w:t>Insert one or more zero-distribution periods into the contract to cover the paused weeks, advancing the period index to the present without crediting any rewards. This can be implemented as:</w:t>
-      </w:r>
-    </w:p>
-    <w:p>
-      <w:pPr>
-        <w:pStyle w:val="ListBullet"/>
-      </w:pPr>
-      <w:r>
-        <w:t>A single zero-distribution period spanning the entire paused interval, or</w:t>
-      </w:r>
-    </w:p>
-    <w:p>
-      <w:pPr>
-        <w:pStyle w:val="ListBullet"/>
-      </w:pPr>
-      <w:r>
-        <w:t>Individual zero-distribution entries for each of the ~16 paused weeks</w:t>
-      </w:r>
-    </w:p>
-    <w:p/>
-    <w:p>
-      <w:pPr>
-        <w:spacing w:after="120"/>
-      </w:pPr>
-      <w:r>
-        <w:t>Either approach advances the contract's internal state to the current period cleanly, with no effect on users' accumulated balances.</w:t>
-      </w:r>
-    </w:p>
-    <w:p>
-      <w:pPr>
-        <w:pStyle w:val="Heading3"/>
+        <w:spacing w:after="160"/>
       </w:pPr>
       <w:r>
         <w:rPr>
           <w:rFonts w:ascii="Calibri" w:hAnsi="Calibri"/>
-          <w:b/>
-          <w:sz w:val="24"/>
+          <w:sz w:val="22"/>
         </w:rPr>
-        <w:t>Calculation Unchanged</w:t>
-      </w:r>
-    </w:p>
-    <w:p>
-      <w:pPr>
-        <w:spacing w:after="120"/>
-      </w:pPr>
-      <w:r>
-        <w:t>The rebate calculation defined in TANIP-1 is not modified by this amendment:</w:t>
-      </w:r>
-    </w:p>
-    <w:p>
-      <w:pPr>
-        <w:spacing w:after="120" w:before="120"/>
-        <w:ind w:left="567"/>
-        <w:shd w:val="clear" w:color="auto" w:fill="F0F0F0"/>
-      </w:pPr>
-      <w:r>
-        <w:rPr>
-          <w:rFonts w:ascii="Courier New" w:hAnsi="Courier New"/>
-          <w:color w:val="1E1E1E"/>
-          <w:sz w:val="18"/>
-        </w:rPr>
-        <w:t>R = (user_fees / total_fees) × period_allocation</w:t>
-        <w:br/>
-        <w:br/>
-        <w:t>rebate = min(R, stake_cap)        # where stake_cap = TWAS − previously_earned</w:t>
-        <w:br/>
-        <w:t>rebate = min(rebate, fees_paid)   # final fee cap (TANIP-1 rule)</w:t>
-      </w:r>
-    </w:p>
-    <w:p>
-      <w:pPr>
-        <w:spacing w:after="120"/>
-      </w:pPr>
-      <w:r>
-        <w:t>Zero-distribution periods contribute 0 to R for all users, leaving previously_earned balances unchanged.</w:t>
+        <w:t>TANIP-1 was paused for approximately 16 weeks. The on-chain calculator contract tracks cumulative user balances across sequential weekly periods. To resume, the contract's period index must be brought up to date before live distributions can continue.</w:t>
       </w:r>
     </w:p>
     <w:p>
@@ -552,86 +203,185 @@
           <w:rFonts w:ascii="Calibri" w:hAnsi="Calibri"/>
           <w:b/>
           <w:color w:val="1B3A6B"/>
-          <w:sz w:val="28"/>
+          <w:sz w:val="26"/>
         </w:rPr>
-        <w:t>5. Testing &amp; Validation</w:t>
+        <w:t>Change</w:t>
       </w:r>
     </w:p>
     <w:p>
       <w:pPr>
-        <w:spacing w:after="120"/>
+        <w:spacing w:after="160"/>
       </w:pPr>
       <w:r>
-        <w:t>Prior to this proposal being formalised, the approach was tested end-to-end. The following was confirmed:</w:t>
+        <w:rPr>
+          <w:rFonts w:ascii="Calibri" w:hAnsi="Calibri"/>
+          <w:sz w:val="22"/>
+        </w:rPr>
+        <w:t xml:space="preserve">Rather than redeploying new contracts — which would erase users' </w:t>
+      </w:r>
+      <w:r>
+        <w:rPr>
+          <w:rFonts w:ascii="Courier New" w:hAnsi="Courier New"/>
+          <w:sz w:val="20"/>
+        </w:rPr>
+        <w:t>total_earned</w:t>
+      </w:r>
+      <w:r>
+        <w:rPr>
+          <w:rFonts w:ascii="Calibri" w:hAnsi="Calibri"/>
+          <w:sz w:val="22"/>
+        </w:rPr>
+        <w:t xml:space="preserve"> histories — the program will resume using the </w:t>
+      </w:r>
+      <w:r>
+        <w:rPr>
+          <w:rFonts w:ascii="Calibri" w:hAnsi="Calibri"/>
+          <w:b/>
+          <w:sz w:val="22"/>
+        </w:rPr>
+        <w:t>existing contracts</w:t>
+      </w:r>
+      <w:r>
+        <w:rPr>
+          <w:rFonts w:ascii="Calibri" w:hAnsi="Calibri"/>
+          <w:sz w:val="22"/>
+        </w:rPr>
+        <w:t xml:space="preserve">. The paused weeks will be bridged by submitting one or more </w:t>
+      </w:r>
+      <w:r>
+        <w:rPr>
+          <w:rFonts w:ascii="Calibri" w:hAnsi="Calibri"/>
+          <w:b/>
+          <w:sz w:val="22"/>
+        </w:rPr>
+        <w:t>periods with zero distributions</w:t>
+      </w:r>
+      <w:r>
+        <w:rPr>
+          <w:rFonts w:ascii="Calibri" w:hAnsi="Calibri"/>
+          <w:sz w:val="22"/>
+        </w:rPr>
+        <w:t>, advancing the contract's internal period index to the present without crediting any rewards or altering any user balances.</w:t>
+      </w:r>
+    </w:p>
+    <w:p>
+      <w:pPr>
+        <w:spacing w:after="160"/>
+      </w:pPr>
+      <w:r>
+        <w:rPr>
+          <w:rFonts w:ascii="Calibri" w:hAnsi="Calibri"/>
+          <w:sz w:val="22"/>
+        </w:rPr>
+        <w:t>This was tested end-to-end and confirmed:</w:t>
       </w:r>
     </w:p>
     <w:p>
       <w:pPr>
         <w:pStyle w:val="ListNumber"/>
+        <w:spacing w:after="80"/>
       </w:pPr>
       <w:r>
         <w:rPr>
-          <w:b w:val="0"/>
+          <w:rFonts w:ascii="Calibri" w:hAnsi="Calibri"/>
+          <w:sz w:val="22"/>
         </w:rPr>
-        <w:t xml:space="preserve">Smart contract accepts zero inputs — </w:t>
-      </w:r>
-      <w:r>
-        <w:rPr>
-          <w:b/>
-        </w:rPr>
-        <w:t>Smart contract accepts zero inputs —</w:t>
-      </w:r>
-      <w:r>
-        <w:t xml:space="preserve"> The calculator contract processes a period with a zero allocation value without reverting or corrupting state.</w:t>
+        <w:t>The smart contract accepts zero-value period inputs without reverting or corrupting state.</w:t>
       </w:r>
     </w:p>
     <w:p>
       <w:pPr>
         <w:pStyle w:val="ListNumber"/>
+        <w:spacing w:after="80"/>
       </w:pPr>
       <w:r>
         <w:rPr>
-          <w:b w:val="0"/>
+          <w:rFonts w:ascii="Calibri" w:hAnsi="Calibri"/>
+          <w:sz w:val="22"/>
         </w:rPr>
-        <w:t xml:space="preserve">Off-chain script handles zero distributions — </w:t>
-      </w:r>
-      <w:r>
-        <w:rPr>
-          <w:b/>
-        </w:rPr>
-        <w:t>Off-chain script handles zero distributions —</w:t>
-      </w:r>
-      <w:r>
-        <w:t xml:space="preserve"> The distribution script runs successfully when passed zero-value period data, producing no payouts and no errors.</w:t>
+        <w:t>The off-chain distribution script handles zero-value data correctly, producing no payouts and no errors.</w:t>
       </w:r>
     </w:p>
     <w:p>
       <w:pPr>
         <w:pStyle w:val="ListNumber"/>
+        <w:spacing w:after="80"/>
       </w:pPr>
       <w:r>
         <w:rPr>
-          <w:b w:val="0"/>
+          <w:rFonts w:ascii="Calibri" w:hAnsi="Calibri"/>
+          <w:sz w:val="22"/>
         </w:rPr>
-        <w:t xml:space="preserve">System continues normally after bridging — </w:t>
-      </w:r>
-      <w:r>
-        <w:rPr>
-          <w:b/>
-        </w:rPr>
-        <w:t>System continues normally after bridging —</w:t>
-      </w:r>
-      <w:r>
-        <w:t xml:space="preserve"> Following the zero-distribution bridge, a subsequent live distribution period was processed correctly, with accurate reward calculations and no balance drift.</w:t>
+        <w:t>Subsequent live distribution periods process correctly after the bridge.</w:t>
       </w:r>
     </w:p>
     <w:p/>
     <w:p>
+      <w:pPr>
+        <w:pStyle w:val="Heading2"/>
+      </w:pPr>
       <w:r>
         <w:rPr>
+          <w:rFonts w:ascii="Calibri" w:hAnsi="Calibri"/>
           <w:b/>
+          <w:color w:val="1B3A6B"/>
+          <w:sz w:val="26"/>
         </w:rPr>
-        <w:t>All three tests passed. The approach is confirmed safe to implement.</w:t>
+        <w:t>Effect on the Calculation</w:t>
+      </w:r>
+    </w:p>
+    <w:p>
+      <w:pPr>
+        <w:spacing w:after="160"/>
+      </w:pPr>
+      <w:r>
+        <w:rPr>
+          <w:rFonts w:ascii="Calibri" w:hAnsi="Calibri"/>
+          <w:sz w:val="22"/>
+        </w:rPr>
+        <w:t xml:space="preserve">No change to the formula defined in TANIP-1. Zero-distribution periods contribute </w:t>
+      </w:r>
+      <w:r>
+        <w:rPr>
+          <w:rFonts w:ascii="Courier New" w:hAnsi="Courier New"/>
+          <w:sz w:val="20"/>
+        </w:rPr>
+        <w:t>0</w:t>
+      </w:r>
+      <w:r>
+        <w:rPr>
+          <w:rFonts w:ascii="Calibri" w:hAnsi="Calibri"/>
+          <w:sz w:val="22"/>
+        </w:rPr>
+        <w:t xml:space="preserve"> to </w:t>
+      </w:r>
+      <w:r>
+        <w:rPr>
+          <w:rFonts w:ascii="Courier New" w:hAnsi="Courier New"/>
+          <w:sz w:val="20"/>
+        </w:rPr>
+        <w:t>R</w:t>
+      </w:r>
+      <w:r>
+        <w:rPr>
+          <w:rFonts w:ascii="Calibri" w:hAnsi="Calibri"/>
+          <w:sz w:val="22"/>
+        </w:rPr>
+        <w:t xml:space="preserve"> for all users, so </w:t>
+      </w:r>
+      <w:r>
+        <w:rPr>
+          <w:rFonts w:ascii="Courier New" w:hAnsi="Courier New"/>
+          <w:sz w:val="20"/>
+        </w:rPr>
+        <w:t>previously_earned</w:t>
+      </w:r>
+      <w:r>
+        <w:rPr>
+          <w:rFonts w:ascii="Calibri" w:hAnsi="Calibri"/>
+          <w:sz w:val="22"/>
+        </w:rPr>
+        <w:t xml:space="preserve"> balances are unaffected. The stake cap resumes correctly from each user's existing history.</w:t>
       </w:r>
     </w:p>
     <w:p>
@@ -643,40 +393,21 @@
           <w:rFonts w:ascii="Calibri" w:hAnsi="Calibri"/>
           <w:b/>
           <w:color w:val="1B3A6B"/>
-          <w:sz w:val="28"/>
+          <w:sz w:val="26"/>
         </w:rPr>
-        <w:t>6. Rationale for Using Existing Contracts</w:t>
+        <w:t>Budget</w:t>
       </w:r>
     </w:p>
     <w:p>
       <w:pPr>
-        <w:spacing w:after="120"/>
-      </w:pPr>
-      <w:r>
-        <w:t>Redeploying contracts would erase every user's total_earned history. Under the stake cap formula:</w:t>
-      </w:r>
-    </w:p>
-    <w:p>
-      <w:pPr>
-        <w:spacing w:after="120" w:before="120"/>
-        <w:ind w:left="567"/>
-        <w:shd w:val="clear" w:color="auto" w:fill="F0F0F0"/>
+        <w:spacing w:after="160"/>
       </w:pPr>
       <w:r>
         <w:rPr>
-          <w:rFonts w:ascii="Courier New" w:hAnsi="Courier New"/>
-          <w:color w:val="1E1E1E"/>
-          <w:sz w:val="18"/>
+          <w:rFonts w:ascii="Calibri" w:hAnsi="Calibri"/>
+          <w:sz w:val="22"/>
         </w:rPr>
-        <w:t>stake_cap = time_weighted_average_stake − total_earned</w:t>
-      </w:r>
-    </w:p>
-    <w:p>
-      <w:pPr>
-        <w:spacing w:after="120"/>
-      </w:pPr>
-      <w:r>
-        <w:t>Resetting total_earned to zero would artificially inflate each user's reward cap in the first period after relaunch, potentially allowing outsized payouts inconsistent with their actual staking history. Preserving the existing contract state ensures the program resumes with accurate, fair caps for all participants.</w:t>
+        <w:t>The paused weeks are not retroactively distributed. The ~51.2M TEL saved during the pause (16 weeks × 3,205,128.205 TEL) is not reallocated by this amendment.</w:t>
       </w:r>
     </w:p>
     <w:p>
@@ -688,297 +419,21 @@
           <w:rFonts w:ascii="Calibri" w:hAnsi="Calibri"/>
           <w:b/>
           <w:color w:val="1B3A6B"/>
-          <w:sz w:val="28"/>
+          <w:sz w:val="26"/>
         </w:rPr>
-        <w:t>7. Budget Impact</w:t>
+        <w:t>All Other Terms</w:t>
       </w:r>
     </w:p>
     <w:p>
       <w:pPr>
-        <w:spacing w:after="120"/>
-      </w:pPr>
-      <w:r>
-        <w:t>The pause period represents a budget saving of approximately 51.2M TEL. This amendment does not propose reimbursing or retroactively distributing rewards for the paused weeks. The zero-distribution bridge is a technical continuity mechanism only; it carries no cost.</w:t>
-      </w:r>
-    </w:p>
-    <w:p>
-      <w:pPr>
-        <w:spacing w:after="120"/>
-      </w:pPr>
-      <w:r>
-        <w:t>Going forward, the weekly allocation of 3,205,128.205 TEL per week resumes as defined in TANIP-1.</w:t>
-      </w:r>
-    </w:p>
-    <w:p>
-      <w:pPr>
-        <w:pStyle w:val="Heading2"/>
+        <w:spacing w:after="160"/>
       </w:pPr>
       <w:r>
         <w:rPr>
           <w:rFonts w:ascii="Calibri" w:hAnsi="Calibri"/>
-          <w:b/>
-          <w:color w:val="1B3A6B"/>
-          <w:sz w:val="28"/>
+          <w:sz w:val="22"/>
         </w:rPr>
-        <w:t>8. Implementation Timeline</w:t>
-      </w:r>
-    </w:p>
-    <w:tbl>
-      <w:tblPr>
-        <w:tblStyle w:val="TableGrid"/>
-        <w:tblW w:type="auto" w:w="0"/>
-        <w:jc w:val="left"/>
-        <w:tblLook w:firstColumn="1" w:firstRow="1" w:lastColumn="0" w:lastRow="0" w:noHBand="0" w:noVBand="1" w:val="04A0"/>
-      </w:tblPr>
-      <w:tblGrid>
-        <w:gridCol w:w="4533"/>
-        <w:gridCol w:w="4533"/>
-      </w:tblGrid>
-      <w:tr>
-        <w:tc>
-          <w:tcPr>
-            <w:tcW w:type="dxa" w:w="3402"/>
-            <w:shd w:val="clear" w:color="auto" w:fill="1B3A6B"/>
-          </w:tcPr>
-          <w:p>
-            <w:r/>
-            <w:r>
-              <w:rPr>
-                <w:rFonts w:ascii="Calibri" w:hAnsi="Calibri"/>
-                <w:b/>
-                <w:color w:val="FFFFFF"/>
-                <w:sz w:val="20"/>
-              </w:rPr>
-              <w:t>Step</w:t>
-            </w:r>
-          </w:p>
-        </w:tc>
-        <w:tc>
-          <w:tcPr>
-            <w:tcW w:type="dxa" w:w="5669"/>
-            <w:shd w:val="clear" w:color="auto" w:fill="1B3A6B"/>
-          </w:tcPr>
-          <w:p>
-            <w:r/>
-            <w:r>
-              <w:rPr>
-                <w:rFonts w:ascii="Calibri" w:hAnsi="Calibri"/>
-                <w:b/>
-                <w:color w:val="FFFFFF"/>
-                <w:sz w:val="20"/>
-              </w:rPr>
-              <w:t>Description</w:t>
-            </w:r>
-          </w:p>
-        </w:tc>
-      </w:tr>
-      <w:tr>
-        <w:tc>
-          <w:tcPr>
-            <w:tcW w:type="dxa" w:w="3402"/>
-          </w:tcPr>
-          <w:p>
-            <w:r/>
-            <w:r>
-              <w:rPr>
-                <w:rFonts w:ascii="Calibri" w:hAnsi="Calibri"/>
-                <w:sz w:val="20"/>
-              </w:rPr>
-              <w:t>Amendment approval</w:t>
-            </w:r>
-          </w:p>
-        </w:tc>
-        <w:tc>
-          <w:tcPr>
-            <w:tcW w:type="dxa" w:w="5669"/>
-          </w:tcPr>
-          <w:p>
-            <w:r/>
-            <w:r>
-              <w:rPr>
-                <w:rFonts w:ascii="Calibri" w:hAnsi="Calibri"/>
-                <w:sz w:val="20"/>
-              </w:rPr>
-              <w:t>Governance vote to ratify this approach</w:t>
-            </w:r>
-          </w:p>
-        </w:tc>
-      </w:tr>
-      <w:tr>
-        <w:tc>
-          <w:tcPr>
-            <w:tcW w:type="dxa" w:w="3402"/>
-            <w:shd w:val="clear" w:color="auto" w:fill="EEF2F7"/>
-          </w:tcPr>
-          <w:p>
-            <w:r/>
-            <w:r>
-              <w:rPr>
-                <w:rFonts w:ascii="Calibri" w:hAnsi="Calibri"/>
-                <w:sz w:val="20"/>
-              </w:rPr>
-              <w:t>Zero-distribution bridge</w:t>
-            </w:r>
-          </w:p>
-        </w:tc>
-        <w:tc>
-          <w:tcPr>
-            <w:tcW w:type="dxa" w:w="5669"/>
-            <w:shd w:val="clear" w:color="auto" w:fill="EEF2F7"/>
-          </w:tcPr>
-          <w:p>
-            <w:r/>
-            <w:r>
-              <w:rPr>
-                <w:rFonts w:ascii="Calibri" w:hAnsi="Calibri"/>
-                <w:sz w:val="20"/>
-              </w:rPr>
-              <w:t>Insert bridging periods to bring contract up to date</w:t>
-            </w:r>
-          </w:p>
-        </w:tc>
-      </w:tr>
-      <w:tr>
-        <w:tc>
-          <w:tcPr>
-            <w:tcW w:type="dxa" w:w="3402"/>
-          </w:tcPr>
-          <w:p>
-            <w:r/>
-            <w:r>
-              <w:rPr>
-                <w:rFonts w:ascii="Calibri" w:hAnsi="Calibri"/>
-                <w:sz w:val="20"/>
-              </w:rPr>
-              <w:t>Resumption</w:t>
-            </w:r>
-          </w:p>
-        </w:tc>
-        <w:tc>
-          <w:tcPr>
-            <w:tcW w:type="dxa" w:w="5669"/>
-          </w:tcPr>
-          <w:p>
-            <w:r/>
-            <w:r>
-              <w:rPr>
-                <w:rFonts w:ascii="Calibri" w:hAnsi="Calibri"/>
-                <w:sz w:val="20"/>
-              </w:rPr>
-              <w:t>Begin live weekly distributions</w:t>
-            </w:r>
-          </w:p>
-        </w:tc>
-      </w:tr>
-    </w:tbl>
-    <w:p/>
-    <w:p>
-      <w:pPr>
-        <w:spacing w:after="120"/>
-      </w:pPr>
-      <w:r>
-        <w:t>Target relaunch: within 2 weeks of amendment approval.</w:t>
-      </w:r>
-    </w:p>
-    <w:p>
-      <w:pPr>
-        <w:pStyle w:val="Heading2"/>
-      </w:pPr>
-      <w:r>
-        <w:rPr>
-          <w:rFonts w:ascii="Calibri" w:hAnsi="Calibri"/>
-          <w:b/>
-          <w:color w:val="1B3A6B"/>
-          <w:sz w:val="28"/>
-        </w:rPr>
-        <w:t>9. Amendment Scope</w:t>
-      </w:r>
-    </w:p>
-    <w:p>
-      <w:pPr>
-        <w:spacing w:after="120"/>
-      </w:pPr>
-      <w:r>
-        <w:t>This amendment changes only the mechanism used to resume the program after the pause. No changes are made to:</w:t>
-      </w:r>
-    </w:p>
-    <w:p>
-      <w:pPr>
-        <w:pStyle w:val="ListBullet"/>
-      </w:pPr>
-      <w:r>
-        <w:t>The rebate formula</w:t>
-      </w:r>
-    </w:p>
-    <w:p>
-      <w:pPr>
-        <w:pStyle w:val="ListBullet"/>
-      </w:pPr>
-      <w:r>
-        <w:t>The weekly allocation amount</w:t>
-      </w:r>
-    </w:p>
-    <w:p>
-      <w:pPr>
-        <w:pStyle w:val="ListBullet"/>
-      </w:pPr>
-      <w:r>
-        <w:t>Eligibility rules</w:t>
-      </w:r>
-    </w:p>
-    <w:p>
-      <w:pPr>
-        <w:pStyle w:val="ListBullet"/>
-      </w:pPr>
-      <w:r>
-        <w:t>Referee reward structure</w:t>
-      </w:r>
-    </w:p>
-    <w:p>
-      <w:pPr>
-        <w:pStyle w:val="ListBullet"/>
-      </w:pPr>
-      <w:r>
-        <w:t>The stake cap or fee cap logic</w:t>
-      </w:r>
-    </w:p>
-    <w:p/>
-    <w:p>
-      <w:pPr>
-        <w:spacing w:after="120"/>
-      </w:pPr>
-      <w:r>
-        <w:t>All other terms of TANIP-1 remain in full effect.</w:t>
-      </w:r>
-    </w:p>
-    <w:p>
-      <w:pPr>
-        <w:pStyle w:val="Heading2"/>
-      </w:pPr>
-      <w:r>
-        <w:rPr>
-          <w:rFonts w:ascii="Calibri" w:hAnsi="Calibri"/>
-          <w:b/>
-          <w:color w:val="1B3A6B"/>
-          <w:sz w:val="28"/>
-        </w:rPr>
-        <w:t>10. References</w:t>
-      </w:r>
-    </w:p>
-    <w:p>
-      <w:pPr>
-        <w:pStyle w:val="ListBullet"/>
-      </w:pPr>
-      <w:r>
-        <w:t>TANIP-1: Trading Fee Rebate Program — https://forum.telcoin.org/t/tanip-trading-fee-rebate-program/824</w:t>
-      </w:r>
-    </w:p>
-    <w:p>
-      <w:pPr>
-        <w:pStyle w:val="ListBullet"/>
-      </w:pPr>
-      <w:r>
-        <w:t>Snapshot vote — TANIP-1 ratification — https://snapshot.org/#/s:telcointancouncil.eth/proposal/0xe8557885f5cade3a008e720e0507c272f13b9a6bdb6a52920dadc39269aa754e</w:t>
+        <w:t>All other terms of TANIP-1 remain unchanged. Target relaunch is within 2 weeks of this amendment passing.</w:t>
       </w:r>
     </w:p>
     <w:sectPr>
@@ -1354,10 +809,6 @@
     <w:name w:val="Normal"/>
     <w:qFormat/>
     <w:rsid w:val="00FC693F"/>
-    <w:rPr>
-      <w:rFonts w:ascii="Calibri" w:hAnsi="Calibri"/>
-      <w:sz w:val="22"/>
-    </w:rPr>
   </w:style>
   <w:style w:type="paragraph" w:styleId="Header">
     <w:name w:val="header"/>

</xml_diff>

<commit_message>
Rewrite proposal as full amended version of original TANIP-1 text
Incorporates original proposal body verbatim with two targeted changes:
- Implementation: reuse existing TANIssuanceHistory contract via
  zero-distribution period bridge (no redeployment, no history loss)
- Governance: 'existing' contract, not 'newly deployed'

https://claude.ai/code/session_016mQ9whgNKKGDXRPfCYPFhA
</commit_message>
<xml_diff>
--- a/proposals/TANIP-1-Amendment-I.docx
+++ b/proposals/TANIP-1-Amendment-I.docx
@@ -4,21 +4,22 @@
   <w:body>
     <w:p>
       <w:pPr>
-        <w:jc w:val="center"/>
+        <w:spacing w:after="80"/>
+        <w:jc w:val="left"/>
       </w:pPr>
       <w:r>
         <w:rPr>
           <w:rFonts w:ascii="Calibri" w:hAnsi="Calibri"/>
           <w:b/>
           <w:color w:val="1B3A6B"/>
-          <w:sz w:val="44"/>
+          <w:sz w:val="36"/>
         </w:rPr>
-        <w:t>TANIP-1 Amendment I</w:t>
+        <w:t>TEL Issuance at the Application Layer — Stakers</w:t>
       </w:r>
     </w:p>
     <w:p>
       <w:pPr>
-        <w:jc w:val="center"/>
+        <w:spacing w:after="200"/>
       </w:pPr>
       <w:r>
         <w:rPr>
@@ -26,151 +27,123 @@
           <w:color w:val="5A5A5A"/>
           <w:sz w:val="26"/>
         </w:rPr>
-        <w:t>Zero-Distribution Period Bridge</w:t>
+        <w:t>Transition to a Trading Fee Rebate Program</w:t>
       </w:r>
     </w:p>
-    <w:p/>
-    <w:tbl>
-      <w:tblPr>
-        <w:tblStyle w:val="TableGrid"/>
-        <w:tblW w:type="auto" w:w="0"/>
-        <w:tblLook w:firstColumn="1" w:firstRow="1" w:lastColumn="0" w:lastRow="0" w:noHBand="0" w:noVBand="1" w:val="04A0"/>
-      </w:tblPr>
-      <w:tblGrid>
-        <w:gridCol w:w="4533"/>
-        <w:gridCol w:w="4533"/>
-      </w:tblGrid>
-      <w:tr>
-        <w:tc>
-          <w:tcPr>
-            <w:tcW w:type="dxa" w:w="1984"/>
-          </w:tcPr>
-          <w:p>
-            <w:r>
-              <w:rPr>
-                <w:rFonts w:ascii="Calibri" w:hAnsi="Calibri"/>
-                <w:b/>
-                <w:sz w:val="20"/>
-              </w:rPr>
-              <w:t>Status</w:t>
-            </w:r>
-          </w:p>
-        </w:tc>
-        <w:tc>
-          <w:tcPr>
-            <w:tcW w:type="dxa" w:w="7087"/>
-          </w:tcPr>
-          <w:p>
-            <w:r>
-              <w:rPr>
-                <w:rFonts w:ascii="Calibri" w:hAnsi="Calibri"/>
-                <w:sz w:val="20"/>
-              </w:rPr>
-              <w:t>Draft</w:t>
-            </w:r>
-          </w:p>
-        </w:tc>
-      </w:tr>
-      <w:tr>
-        <w:tc>
-          <w:tcPr>
-            <w:tcW w:type="dxa" w:w="1984"/>
-          </w:tcPr>
-          <w:p>
-            <w:r>
-              <w:rPr>
-                <w:rFonts w:ascii="Calibri" w:hAnsi="Calibri"/>
-                <w:b/>
-                <w:sz w:val="20"/>
-              </w:rPr>
-              <w:t>Type</w:t>
-            </w:r>
-          </w:p>
-        </w:tc>
-        <w:tc>
-          <w:tcPr>
-            <w:tcW w:type="dxa" w:w="7087"/>
-          </w:tcPr>
-          <w:p>
-            <w:r>
-              <w:rPr>
-                <w:rFonts w:ascii="Calibri" w:hAnsi="Calibri"/>
-                <w:sz w:val="20"/>
-              </w:rPr>
-              <w:t>Amendment</w:t>
-            </w:r>
-          </w:p>
-        </w:tc>
-      </w:tr>
-      <w:tr>
-        <w:tc>
-          <w:tcPr>
-            <w:tcW w:type="dxa" w:w="1984"/>
-          </w:tcPr>
-          <w:p>
-            <w:r>
-              <w:rPr>
-                <w:rFonts w:ascii="Calibri" w:hAnsi="Calibri"/>
-                <w:b/>
-                <w:sz w:val="20"/>
-              </w:rPr>
-              <w:t>Amends</w:t>
-            </w:r>
-          </w:p>
-        </w:tc>
-        <w:tc>
-          <w:tcPr>
-            <w:tcW w:type="dxa" w:w="7087"/>
-          </w:tcPr>
-          <w:p>
-            <w:r>
-              <w:rPr>
-                <w:rFonts w:ascii="Calibri" w:hAnsi="Calibri"/>
-                <w:sz w:val="20"/>
-              </w:rPr>
-              <w:t>TANIP-1 — Trading Fee Rebate Program</w:t>
-              <w:br/>
-              <w:t>https://forum.telcoin.org/t/tanip-trading-fee-rebate-program/824</w:t>
-            </w:r>
-          </w:p>
-        </w:tc>
-      </w:tr>
-      <w:tr>
-        <w:tc>
-          <w:tcPr>
-            <w:tcW w:type="dxa" w:w="1984"/>
-          </w:tcPr>
-          <w:p>
-            <w:r>
-              <w:rPr>
-                <w:rFonts w:ascii="Calibri" w:hAnsi="Calibri"/>
-                <w:b/>
-                <w:sz w:val="20"/>
-              </w:rPr>
-              <w:t>Date</w:t>
-            </w:r>
-          </w:p>
-        </w:tc>
-        <w:tc>
-          <w:tcPr>
-            <w:tcW w:type="dxa" w:w="7087"/>
-          </w:tcPr>
-          <w:p>
-            <w:r>
-              <w:rPr>
-                <w:rFonts w:ascii="Calibri" w:hAnsi="Calibri"/>
-                <w:sz w:val="20"/>
-              </w:rPr>
-              <w:t>April 2026</w:t>
-            </w:r>
-          </w:p>
-        </w:tc>
-      </w:tr>
-    </w:tbl>
+    <w:p>
+      <w:pPr>
+        <w:spacing w:after="40"/>
+      </w:pPr>
+      <w:r>
+        <w:rPr>
+          <w:rFonts w:ascii="Calibri" w:hAnsi="Calibri"/>
+          <w:b/>
+          <w:sz w:val="22"/>
+        </w:rPr>
+        <w:t xml:space="preserve">Submitted by: </w:t>
+      </w:r>
+      <w:r>
+        <w:rPr>
+          <w:rFonts w:ascii="Calibri" w:hAnsi="Calibri"/>
+          <w:sz w:val="22"/>
+        </w:rPr>
+        <w:t>TAN Council</w:t>
+      </w:r>
+    </w:p>
+    <w:p>
+      <w:pPr>
+        <w:spacing w:after="40"/>
+      </w:pPr>
+      <w:r>
+        <w:rPr>
+          <w:rFonts w:ascii="Calibri" w:hAnsi="Calibri"/>
+          <w:b/>
+          <w:sz w:val="22"/>
+        </w:rPr>
+        <w:t xml:space="preserve">Date: </w:t>
+      </w:r>
+      <w:r>
+        <w:rPr>
+          <w:rFonts w:ascii="Calibri" w:hAnsi="Calibri"/>
+          <w:sz w:val="22"/>
+        </w:rPr>
+        <w:t>12.8.2025</w:t>
+      </w:r>
+    </w:p>
+    <w:p>
+      <w:pPr>
+        <w:spacing w:after="0"/>
+        <w:pBdr>
+          <w:bottom w:val="single" w:sz="6" w:space="1" w:color="1B3A6B"/>
+        </w:pBdr>
+      </w:pPr>
+    </w:p>
     <w:p/>
     <w:p>
       <w:pPr>
-        <w:pStyle w:val="Heading2"/>
+        <w:spacing w:after="160"/>
+      </w:pPr>
+      <w:r>
+        <w:rPr>
+          <w:rFonts w:ascii="Calibri" w:hAnsi="Calibri"/>
+          <w:sz w:val="22"/>
+        </w:rPr>
+        <w:t>This proposal is based on the recently completed TANIP-1 findings report and presents a refined path forward for application layer incentives across the Telcoin ecosystem. With TANIP-1 paused and the data now fully analyzed, the Council is proposing a shift from issuance-based rewards to a more sustainable rebate-based model that continues to incentivize real activity while removing misaligned incentives observed during the program.</w:t>
+      </w:r>
+    </w:p>
+    <w:p>
+      <w:pPr>
+        <w:spacing w:before="240" w:after="80"/>
+      </w:pPr>
+      <w:r>
+        <w:rPr>
+          <w:rFonts w:ascii="Calibri" w:hAnsi="Calibri"/>
+          <w:b/>
+          <w:color w:val="1B3A6B"/>
+          <w:sz w:val="26"/>
+        </w:rPr>
+        <w:t>Overview</w:t>
+      </w:r>
+    </w:p>
+    <w:p>
+      <w:pPr>
+        <w:spacing w:after="160"/>
+      </w:pPr>
+      <w:r>
+        <w:rPr>
+          <w:rFonts w:ascii="Calibri" w:hAnsi="Calibri"/>
+          <w:sz w:val="22"/>
+        </w:rPr>
+        <w:t>TANIP-1 successfully implemented the unified staking model for stakers and demonstrated that issuance can be distributed based on verified on chain behaviour within the Telcoin Platform. Weekly distributions of 3.2M TEL worked reliably, the computation framework performed as intended, and the data was transparent and auditable.</w:t>
+      </w:r>
+    </w:p>
+    <w:p>
+      <w:pPr>
+        <w:spacing w:after="160"/>
+      </w:pPr>
+      <w:r>
+        <w:rPr>
+          <w:rFonts w:ascii="Calibri" w:hAnsi="Calibri"/>
+          <w:sz w:val="22"/>
+        </w:rPr>
+        <w:t>The findings showed, however, that most of the fee activity during TANIP-1 came from short term participants responding directly to issuance. Weekly fees converged around the issuance amount and dropped sharply once the program was paused. Wallet activity remained mostly flat. Referral activity often became circular. These indicators suggest that the program attracted mercenary capital more than long term users of TAN applications.</w:t>
+      </w:r>
+    </w:p>
+    <w:p>
+      <w:pPr>
+        <w:spacing w:after="160"/>
+      </w:pPr>
+      <w:r>
+        <w:rPr>
+          <w:rFonts w:ascii="Calibri" w:hAnsi="Calibri"/>
+          <w:sz w:val="22"/>
+        </w:rPr>
+        <w:t>This proposal introduces a Trading Fee Rebate Program that keeps the core mechanics of TANIP-1 intact while removing the incentive for fee cycling. The goal is to continue rewarding genuine network participation in a way that is sustainable for the current stage of TAN's development.</w:t>
+      </w:r>
+    </w:p>
+    <w:p>
+      <w:pPr>
+        <w:spacing w:before="240" w:after="80"/>
       </w:pPr>
       <w:r>
         <w:rPr>
@@ -191,21 +164,7 @@
           <w:rFonts w:ascii="Calibri" w:hAnsi="Calibri"/>
           <w:sz w:val="22"/>
         </w:rPr>
-        <w:t>TANIP-1 was paused for approximately 16 weeks. The on-chain calculator contract tracks cumulative user balances across sequential weekly periods. To resume, the contract's period index must be brought up to date before live distributions can continue.</w:t>
-      </w:r>
-    </w:p>
-    <w:p>
-      <w:pPr>
-        <w:pStyle w:val="Heading2"/>
-      </w:pPr>
-      <w:r>
-        <w:rPr>
-          <w:rFonts w:ascii="Calibri" w:hAnsi="Calibri"/>
-          <w:b/>
-          <w:color w:val="1B3A6B"/>
-          <w:sz w:val="26"/>
-        </w:rPr>
-        <w:t>Change</w:t>
+        <w:t>TANIP-1 was launched to operationalize user ownership at the application layer. It activated the Stakers miner group, implemented transparent issuance logic, and allowed participants to earn TEL through their own on chain activity and the activity of their referees.</w:t>
       </w:r>
     </w:p>
     <w:p>
@@ -217,51 +176,85 @@
           <w:rFonts w:ascii="Calibri" w:hAnsi="Calibri"/>
           <w:sz w:val="22"/>
         </w:rPr>
-        <w:t xml:space="preserve">Rather than redeploying new contracts — which would erase users' </w:t>
+        <w:t>The findings report highlighted key behaviours:</w:t>
       </w:r>
-      <w:r>
-        <w:rPr>
-          <w:rFonts w:ascii="Courier New" w:hAnsi="Courier New"/>
-          <w:sz w:val="20"/>
-        </w:rPr>
-        <w:t>total_earned</w:t>
-      </w:r>
+    </w:p>
+    <w:p>
+      <w:pPr>
+        <w:pStyle w:val="ListBullet"/>
+        <w:spacing w:after="60"/>
+      </w:pPr>
       <w:r>
         <w:rPr>
           <w:rFonts w:ascii="Calibri" w:hAnsi="Calibri"/>
           <w:sz w:val="22"/>
         </w:rPr>
-        <w:t xml:space="preserve"> histories — the program will resume using the </w:t>
+        <w:t>Fees rose until they matched issuance levels</w:t>
       </w:r>
-      <w:r>
-        <w:rPr>
-          <w:rFonts w:ascii="Calibri" w:hAnsi="Calibri"/>
-          <w:b/>
-          <w:sz w:val="22"/>
-        </w:rPr>
-        <w:t>existing contracts</w:t>
-      </w:r>
+    </w:p>
+    <w:p>
+      <w:pPr>
+        <w:pStyle w:val="ListBullet"/>
+        <w:spacing w:after="60"/>
+      </w:pPr>
       <w:r>
         <w:rPr>
           <w:rFonts w:ascii="Calibri" w:hAnsi="Calibri"/>
           <w:sz w:val="22"/>
         </w:rPr>
-        <w:t xml:space="preserve">. The paused weeks will be bridged by submitting one or more </w:t>
+        <w:t>Fees dropped immediately when issuance paused</w:t>
       </w:r>
-      <w:r>
-        <w:rPr>
-          <w:rFonts w:ascii="Calibri" w:hAnsi="Calibri"/>
-          <w:b/>
-          <w:sz w:val="22"/>
-        </w:rPr>
-        <w:t>periods with zero distributions</w:t>
-      </w:r>
+    </w:p>
+    <w:p>
+      <w:pPr>
+        <w:pStyle w:val="ListBullet"/>
+        <w:spacing w:after="60"/>
+      </w:pPr>
       <w:r>
         <w:rPr>
           <w:rFonts w:ascii="Calibri" w:hAnsi="Calibri"/>
           <w:sz w:val="22"/>
         </w:rPr>
-        <w:t>, advancing the contract's internal period index to the present without crediting any rewards or altering any user balances.</w:t>
+        <w:t>Weekly active wallet counts remained mostly unchanged</w:t>
+      </w:r>
+    </w:p>
+    <w:p>
+      <w:pPr>
+        <w:pStyle w:val="ListBullet"/>
+        <w:spacing w:after="60"/>
+      </w:pPr>
+      <w:r>
+        <w:rPr>
+          <w:rFonts w:ascii="Calibri" w:hAnsi="Calibri"/>
+          <w:sz w:val="22"/>
+        </w:rPr>
+        <w:t>New wallets followed a churn pattern rather than cumulative growth</w:t>
+      </w:r>
+    </w:p>
+    <w:p>
+      <w:pPr>
+        <w:pStyle w:val="ListBullet"/>
+        <w:spacing w:after="60"/>
+      </w:pPr>
+      <w:r>
+        <w:rPr>
+          <w:rFonts w:ascii="Calibri" w:hAnsi="Calibri"/>
+          <w:sz w:val="22"/>
+        </w:rPr>
+        <w:t>Referral flows often became self-referential</w:t>
+      </w:r>
+    </w:p>
+    <w:p/>
+    <w:p>
+      <w:pPr>
+        <w:spacing w:after="160"/>
+      </w:pPr>
+      <w:r>
+        <w:rPr>
+          <w:rFonts w:ascii="Calibri" w:hAnsi="Calibri"/>
+          <w:sz w:val="22"/>
+        </w:rPr>
+        <w:t>These patterns show that the system worked mechanically, but the economic incentives encouraged fee rotation instead of organic use.</w:t>
       </w:r>
     </w:p>
     <w:p>
@@ -273,52 +266,12 @@
           <w:rFonts w:ascii="Calibri" w:hAnsi="Calibri"/>
           <w:sz w:val="22"/>
         </w:rPr>
-        <w:t>This was tested end-to-end and confirmed:</w:t>
+        <w:t>A rebate model preserves the positive aspects of TANIP-1 while aligning incentives more closely with genuine behaviour.</w:t>
       </w:r>
     </w:p>
     <w:p>
       <w:pPr>
-        <w:pStyle w:val="ListNumber"/>
-        <w:spacing w:after="80"/>
-      </w:pPr>
-      <w:r>
-        <w:rPr>
-          <w:rFonts w:ascii="Calibri" w:hAnsi="Calibri"/>
-          <w:sz w:val="22"/>
-        </w:rPr>
-        <w:t>The smart contract accepts zero-value period inputs without reverting or corrupting state.</w:t>
-      </w:r>
-    </w:p>
-    <w:p>
-      <w:pPr>
-        <w:pStyle w:val="ListNumber"/>
-        <w:spacing w:after="80"/>
-      </w:pPr>
-      <w:r>
-        <w:rPr>
-          <w:rFonts w:ascii="Calibri" w:hAnsi="Calibri"/>
-          <w:sz w:val="22"/>
-        </w:rPr>
-        <w:t>The off-chain distribution script handles zero-value data correctly, producing no payouts and no errors.</w:t>
-      </w:r>
-    </w:p>
-    <w:p>
-      <w:pPr>
-        <w:pStyle w:val="ListNumber"/>
-        <w:spacing w:after="80"/>
-      </w:pPr>
-      <w:r>
-        <w:rPr>
-          <w:rFonts w:ascii="Calibri" w:hAnsi="Calibri"/>
-          <w:sz w:val="22"/>
-        </w:rPr>
-        <w:t>Subsequent live distribution periods process correctly after the bridge.</w:t>
-      </w:r>
-    </w:p>
-    <w:p/>
-    <w:p>
-      <w:pPr>
-        <w:pStyle w:val="Heading2"/>
+        <w:spacing w:before="240" w:after="80"/>
       </w:pPr>
       <w:r>
         <w:rPr>
@@ -327,7 +280,7 @@
           <w:color w:val="1B3A6B"/>
           <w:sz w:val="26"/>
         </w:rPr>
-        <w:t>Effect on the Calculation</w:t>
+        <w:t>Proposal: Trading Fee Rebate Program</w:t>
       </w:r>
     </w:p>
     <w:p>
@@ -339,63 +292,21 @@
           <w:rFonts w:ascii="Calibri" w:hAnsi="Calibri"/>
           <w:sz w:val="22"/>
         </w:rPr>
-        <w:t xml:space="preserve">No change to the formula defined in TANIP-1. Zero-distribution periods contribute </w:t>
-      </w:r>
-      <w:r>
-        <w:rPr>
-          <w:rFonts w:ascii="Courier New" w:hAnsi="Courier New"/>
-          <w:sz w:val="20"/>
-        </w:rPr>
-        <w:t>0</w:t>
-      </w:r>
-      <w:r>
-        <w:rPr>
-          <w:rFonts w:ascii="Calibri" w:hAnsi="Calibri"/>
-          <w:sz w:val="22"/>
-        </w:rPr>
-        <w:t xml:space="preserve"> to </w:t>
-      </w:r>
-      <w:r>
-        <w:rPr>
-          <w:rFonts w:ascii="Courier New" w:hAnsi="Courier New"/>
-          <w:sz w:val="20"/>
-        </w:rPr>
-        <w:t>R</w:t>
-      </w:r>
-      <w:r>
-        <w:rPr>
-          <w:rFonts w:ascii="Calibri" w:hAnsi="Calibri"/>
-          <w:sz w:val="22"/>
-        </w:rPr>
-        <w:t xml:space="preserve"> for all users, so </w:t>
-      </w:r>
-      <w:r>
-        <w:rPr>
-          <w:rFonts w:ascii="Courier New" w:hAnsi="Courier New"/>
-          <w:sz w:val="20"/>
-        </w:rPr>
-        <w:t>previously_earned</w:t>
-      </w:r>
-      <w:r>
-        <w:rPr>
-          <w:rFonts w:ascii="Calibri" w:hAnsi="Calibri"/>
-          <w:sz w:val="22"/>
-        </w:rPr>
-        <w:t xml:space="preserve"> balances are unaffected. The stake cap resumes correctly from each user's existing history.</w:t>
+        <w:t>This proposal aims to replace issuance-based rewards with a capped rebate system that uses the same TANIP-1 architecture and logic but limits rewards to the amount of TEL each wallet actually paid in fees during each period.</w:t>
       </w:r>
     </w:p>
     <w:p>
       <w:pPr>
-        <w:pStyle w:val="Heading2"/>
+        <w:spacing w:before="160" w:after="40"/>
       </w:pPr>
       <w:r>
         <w:rPr>
           <w:rFonts w:ascii="Calibri" w:hAnsi="Calibri"/>
           <w:b/>
-          <w:color w:val="1B3A6B"/>
-          <w:sz w:val="26"/>
+          <w:color w:val="000000"/>
+          <w:sz w:val="22"/>
         </w:rPr>
-        <w:t>Budget</w:t>
+        <w:t>Program Structure</w:t>
       </w:r>
     </w:p>
     <w:p>
@@ -407,21 +318,159 @@
           <w:rFonts w:ascii="Calibri" w:hAnsi="Calibri"/>
           <w:sz w:val="22"/>
         </w:rPr>
-        <w:t>The paused weeks are not retroactively distributed. The ~51.2M TEL saved during the pause (16 weeks × 3,205,128.205 TEL) is not reallocated by this amendment.</w:t>
+        <w:t>The following elements remain unchanged:</w:t>
       </w:r>
     </w:p>
     <w:p>
       <w:pPr>
-        <w:pStyle w:val="Heading2"/>
+        <w:pStyle w:val="ListBullet"/>
+        <w:spacing w:after="60"/>
+      </w:pPr>
+      <w:r>
+        <w:rPr>
+          <w:rFonts w:ascii="Calibri" w:hAnsi="Calibri"/>
+          <w:sz w:val="22"/>
+        </w:rPr>
+        <w:t>Stake requirement through the StakingModule</w:t>
+      </w:r>
+    </w:p>
+    <w:p>
+      <w:pPr>
+        <w:pStyle w:val="ListBullet"/>
+        <w:spacing w:after="60"/>
+      </w:pPr>
+      <w:r>
+        <w:rPr>
+          <w:rFonts w:ascii="Calibri" w:hAnsi="Calibri"/>
+          <w:sz w:val="22"/>
+        </w:rPr>
+        <w:t>Referral tree logic</w:t>
+      </w:r>
+    </w:p>
+    <w:p>
+      <w:pPr>
+        <w:pStyle w:val="ListBullet"/>
+        <w:spacing w:after="60"/>
+      </w:pPr>
+      <w:r>
+        <w:rPr>
+          <w:rFonts w:ascii="Calibri" w:hAnsi="Calibri"/>
+          <w:sz w:val="22"/>
+        </w:rPr>
+        <w:t>On chain fee verification through aggregator-to-AmirX transfers</w:t>
+      </w:r>
+    </w:p>
+    <w:p>
+      <w:pPr>
+        <w:pStyle w:val="ListBullet"/>
+        <w:spacing w:after="60"/>
+      </w:pPr>
+      <w:r>
+        <w:rPr>
+          <w:rFonts w:ascii="Calibri" w:hAnsi="Calibri"/>
+          <w:sz w:val="22"/>
+        </w:rPr>
+        <w:t>Deterministic off chain calculation</w:t>
+      </w:r>
+    </w:p>
+    <w:p>
+      <w:pPr>
+        <w:pStyle w:val="ListBullet"/>
+        <w:spacing w:after="60"/>
+      </w:pPr>
+      <w:r>
+        <w:rPr>
+          <w:rFonts w:ascii="Calibri" w:hAnsi="Calibri"/>
+          <w:sz w:val="22"/>
+        </w:rPr>
+        <w:t>Weekly batched uploads to TANIssuanceHistory</w:t>
+      </w:r>
+    </w:p>
+    <w:p>
+      <w:pPr>
+        <w:pStyle w:val="ListBullet"/>
+        <w:spacing w:after="60"/>
+      </w:pPr>
+      <w:r>
+        <w:rPr>
+          <w:rFonts w:ascii="Calibri" w:hAnsi="Calibri"/>
+          <w:sz w:val="22"/>
+        </w:rPr>
+        <w:t>Network-agnostic design that future developers can adopt</w:t>
+      </w:r>
+    </w:p>
+    <w:p/>
+    <w:p>
+      <w:pPr>
+        <w:spacing w:after="160"/>
+      </w:pPr>
+      <w:r>
+        <w:rPr>
+          <w:rFonts w:ascii="Calibri" w:hAnsi="Calibri"/>
+          <w:sz w:val="22"/>
+        </w:rPr>
+        <w:t>The only modification is the introduction of a rebate cap.</w:t>
+      </w:r>
+    </w:p>
+    <w:p>
+      <w:pPr>
+        <w:spacing w:before="160" w:after="40"/>
       </w:pPr>
       <w:r>
         <w:rPr>
           <w:rFonts w:ascii="Calibri" w:hAnsi="Calibri"/>
           <w:b/>
-          <w:color w:val="1B3A6B"/>
-          <w:sz w:val="26"/>
+          <w:color w:val="000000"/>
+          <w:sz w:val="22"/>
         </w:rPr>
-        <w:t>All Other Terms</w:t>
+        <w:t>Rebate Formula</w:t>
+      </w:r>
+    </w:p>
+    <w:p>
+      <w:pPr>
+        <w:spacing w:before="80" w:after="160"/>
+        <w:ind w:left="567"/>
+        <w:shd w:val="clear" w:color="auto" w:fill="F0F0F0"/>
+      </w:pPr>
+      <w:r>
+        <w:rPr>
+          <w:rFonts w:ascii="Courier New" w:hAnsi="Courier New"/>
+          <w:sz w:val="19"/>
+        </w:rPr>
+        <w:t>R = calculated issuance from own and referee fees</w:t>
+        <w:br/>
+        <w:t xml:space="preserve">    (following same calculation as original TANIP-1 implementation)</w:t>
+        <w:br/>
+        <w:br/>
+        <w:t>F = total TEL fees paid by the wallet during the period</w:t>
+        <w:br/>
+        <w:br/>
+        <w:t>Final rebate = min(R, F)</w:t>
+      </w:r>
+    </w:p>
+    <w:p>
+      <w:pPr>
+        <w:spacing w:after="80"/>
+      </w:pPr>
+      <w:r>
+        <w:rPr>
+          <w:rFonts w:ascii="Calibri" w:hAnsi="Calibri"/>
+          <w:b/>
+          <w:sz w:val="22"/>
+        </w:rPr>
+        <w:t>Meaning:</w:t>
+      </w:r>
+    </w:p>
+    <w:p>
+      <w:pPr>
+        <w:spacing w:after="80"/>
+      </w:pPr>
+      <w:r>
+        <w:rPr>
+          <w:rFonts w:ascii="Calibri" w:hAnsi="Calibri"/>
+          <w:sz w:val="22"/>
+        </w:rPr>
+        <w:t>If the calculated rebate exceeds the wallet's fee spending, the wallet receives back the amount it paid in fees.</w:t>
       </w:r>
     </w:p>
     <w:p>
@@ -433,7 +482,538 @@
           <w:rFonts w:ascii="Calibri" w:hAnsi="Calibri"/>
           <w:sz w:val="22"/>
         </w:rPr>
-        <w:t>All other terms of TANIP-1 remain unchanged. Target relaunch is within 2 weeks of this amendment passing.</w:t>
+        <w:t>If the calculated rebate is lower than the wallet's fee spending, the wallet receives the full rebate.</w:t>
+      </w:r>
+    </w:p>
+    <w:p>
+      <w:pPr>
+        <w:spacing w:after="160"/>
+      </w:pPr>
+      <w:r>
+        <w:rPr>
+          <w:rFonts w:ascii="Calibri" w:hAnsi="Calibri"/>
+          <w:sz w:val="22"/>
+        </w:rPr>
+        <w:t>This ensures no participant can earn more TEL than they spend, removing the main driver of mercenary volume.</w:t>
+      </w:r>
+    </w:p>
+    <w:p>
+      <w:pPr>
+        <w:spacing w:before="240" w:after="80"/>
+      </w:pPr>
+      <w:r>
+        <w:rPr>
+          <w:rFonts w:ascii="Calibri" w:hAnsi="Calibri"/>
+          <w:b/>
+          <w:color w:val="1B3A6B"/>
+          <w:sz w:val="26"/>
+        </w:rPr>
+        <w:t>Governance, Funding and Transparency</w:t>
+      </w:r>
+    </w:p>
+    <w:p>
+      <w:pPr>
+        <w:spacing w:after="160"/>
+      </w:pPr>
+      <w:r>
+        <w:rPr>
+          <w:rFonts w:ascii="Calibri" w:hAnsi="Calibri"/>
+          <w:sz w:val="22"/>
+        </w:rPr>
+        <w:t>The rebate program will be:</w:t>
+      </w:r>
+    </w:p>
+    <w:p>
+      <w:pPr>
+        <w:pStyle w:val="ListBullet"/>
+        <w:spacing w:after="60"/>
+      </w:pPr>
+      <w:r>
+        <w:rPr>
+          <w:rFonts w:ascii="Calibri" w:hAnsi="Calibri"/>
+          <w:sz w:val="22"/>
+        </w:rPr>
+        <w:t>Funded by the existing TAN Council Safe</w:t>
+      </w:r>
+    </w:p>
+    <w:p>
+      <w:pPr>
+        <w:pStyle w:val="ListBullet"/>
+        <w:spacing w:after="60"/>
+      </w:pPr>
+      <w:r>
+        <w:rPr>
+          <w:rFonts w:ascii="Calibri" w:hAnsi="Calibri"/>
+          <w:sz w:val="22"/>
+        </w:rPr>
+        <w:t>Distributed weekly through the existing TANIssuanceHistory contract</w:t>
+      </w:r>
+    </w:p>
+    <w:p>
+      <w:pPr>
+        <w:pStyle w:val="ListBullet"/>
+        <w:spacing w:after="60"/>
+      </w:pPr>
+      <w:r>
+        <w:rPr>
+          <w:rFonts w:ascii="Calibri" w:hAnsi="Calibri"/>
+          <w:sz w:val="22"/>
+        </w:rPr>
+        <w:t>Transparent, auditable, and consistent with past processes</w:t>
+      </w:r>
+    </w:p>
+    <w:p>
+      <w:pPr>
+        <w:pStyle w:val="ListBullet"/>
+        <w:spacing w:after="60"/>
+      </w:pPr>
+      <w:r>
+        <w:rPr>
+          <w:rFonts w:ascii="Calibri" w:hAnsi="Calibri"/>
+          <w:sz w:val="22"/>
+        </w:rPr>
+        <w:t>Fully controlled by the TAN Council with no reliance on app updates</w:t>
+      </w:r>
+    </w:p>
+    <w:p/>
+    <w:p>
+      <w:pPr>
+        <w:spacing w:after="160"/>
+      </w:pPr>
+      <w:r>
+        <w:rPr>
+          <w:rFonts w:ascii="Calibri" w:hAnsi="Calibri"/>
+          <w:sz w:val="22"/>
+        </w:rPr>
+        <w:t>This structure makes the program predictable for users and developers while safeguarding treasury resources.</w:t>
+      </w:r>
+    </w:p>
+    <w:p>
+      <w:pPr>
+        <w:spacing w:before="240" w:after="80"/>
+      </w:pPr>
+      <w:r>
+        <w:rPr>
+          <w:rFonts w:ascii="Calibri" w:hAnsi="Calibri"/>
+          <w:b/>
+          <w:color w:val="1B3A6B"/>
+          <w:sz w:val="26"/>
+        </w:rPr>
+        <w:t>Next Steps and Council Role</w:t>
+      </w:r>
+    </w:p>
+    <w:p>
+      <w:pPr>
+        <w:spacing w:after="160"/>
+      </w:pPr>
+      <w:r>
+        <w:rPr>
+          <w:rFonts w:ascii="Calibri" w:hAnsi="Calibri"/>
+          <w:sz w:val="22"/>
+        </w:rPr>
+        <w:t>If approved, the Council will:</w:t>
+      </w:r>
+    </w:p>
+    <w:p>
+      <w:pPr>
+        <w:pStyle w:val="ListBullet"/>
+        <w:spacing w:after="60"/>
+      </w:pPr>
+      <w:r>
+        <w:rPr>
+          <w:rFonts w:ascii="Calibri" w:hAnsi="Calibri"/>
+          <w:sz w:val="22"/>
+        </w:rPr>
+        <w:t>Engage the TAO to make the required changes to the TANIP-1 rewards calculation script</w:t>
+      </w:r>
+    </w:p>
+    <w:p>
+      <w:pPr>
+        <w:pStyle w:val="ListBullet"/>
+        <w:spacing w:after="60"/>
+      </w:pPr>
+      <w:r>
+        <w:rPr>
+          <w:rFonts w:ascii="Calibri" w:hAnsi="Calibri"/>
+          <w:sz w:val="22"/>
+        </w:rPr>
+        <w:t>Activate the rebate program</w:t>
+      </w:r>
+    </w:p>
+    <w:p>
+      <w:pPr>
+        <w:pStyle w:val="ListBullet"/>
+        <w:spacing w:after="60"/>
+      </w:pPr>
+      <w:r>
+        <w:rPr>
+          <w:rFonts w:ascii="Calibri" w:hAnsi="Calibri"/>
+          <w:sz w:val="22"/>
+        </w:rPr>
+        <w:t>Maintain weekly reward uploads</w:t>
+      </w:r>
+    </w:p>
+    <w:p>
+      <w:pPr>
+        <w:pStyle w:val="ListBullet"/>
+        <w:spacing w:after="60"/>
+      </w:pPr>
+      <w:r>
+        <w:rPr>
+          <w:rFonts w:ascii="Calibri" w:hAnsi="Calibri"/>
+          <w:sz w:val="22"/>
+        </w:rPr>
+        <w:t>Track participation trends under the new model</w:t>
+      </w:r>
+    </w:p>
+    <w:p>
+      <w:pPr>
+        <w:pStyle w:val="ListBullet"/>
+        <w:spacing w:after="60"/>
+      </w:pPr>
+      <w:r>
+        <w:rPr>
+          <w:rFonts w:ascii="Calibri" w:hAnsi="Calibri"/>
+          <w:sz w:val="22"/>
+        </w:rPr>
+        <w:t>Review program performance as TAN scales</w:t>
+      </w:r>
+    </w:p>
+    <w:p>
+      <w:pPr>
+        <w:pStyle w:val="ListBullet"/>
+        <w:spacing w:after="60"/>
+      </w:pPr>
+      <w:r>
+        <w:rPr>
+          <w:rFonts w:ascii="Calibri" w:hAnsi="Calibri"/>
+          <w:sz w:val="22"/>
+        </w:rPr>
+        <w:t>Evaluate the potential return to the original issuance model once network maturity increases</w:t>
+      </w:r>
+    </w:p>
+    <w:p/>
+    <w:p>
+      <w:pPr>
+        <w:spacing w:after="160"/>
+      </w:pPr>
+      <w:r>
+        <w:rPr>
+          <w:rFonts w:ascii="Calibri" w:hAnsi="Calibri"/>
+          <w:sz w:val="22"/>
+        </w:rPr>
+        <w:t>No new integrations or technical changes are required for stakers.</w:t>
+      </w:r>
+    </w:p>
+    <w:p>
+      <w:pPr>
+        <w:spacing w:before="240" w:after="80"/>
+      </w:pPr>
+      <w:r>
+        <w:rPr>
+          <w:rFonts w:ascii="Calibri" w:hAnsi="Calibri"/>
+          <w:b/>
+          <w:color w:val="1B3A6B"/>
+          <w:sz w:val="26"/>
+        </w:rPr>
+        <w:t>Clarification on Scope</w:t>
+      </w:r>
+    </w:p>
+    <w:p>
+      <w:pPr>
+        <w:spacing w:after="160"/>
+      </w:pPr>
+      <w:r>
+        <w:rPr>
+          <w:rFonts w:ascii="Calibri" w:hAnsi="Calibri"/>
+          <w:sz w:val="22"/>
+        </w:rPr>
+        <w:t>This proposal focuses on the single change of replacing issuance with a capped rebate. It does not alter:</w:t>
+      </w:r>
+    </w:p>
+    <w:p>
+      <w:pPr>
+        <w:pStyle w:val="ListBullet"/>
+        <w:spacing w:after="60"/>
+      </w:pPr>
+      <w:r>
+        <w:rPr>
+          <w:rFonts w:ascii="Calibri" w:hAnsi="Calibri"/>
+          <w:sz w:val="22"/>
+        </w:rPr>
+        <w:t>Referral logic</w:t>
+      </w:r>
+    </w:p>
+    <w:p>
+      <w:pPr>
+        <w:pStyle w:val="ListBullet"/>
+        <w:spacing w:after="60"/>
+      </w:pPr>
+      <w:r>
+        <w:rPr>
+          <w:rFonts w:ascii="Calibri" w:hAnsi="Calibri"/>
+          <w:sz w:val="22"/>
+        </w:rPr>
+        <w:t>Staking logic</w:t>
+      </w:r>
+    </w:p>
+    <w:p>
+      <w:pPr>
+        <w:pStyle w:val="ListBullet"/>
+        <w:spacing w:after="60"/>
+      </w:pPr>
+      <w:r>
+        <w:rPr>
+          <w:rFonts w:ascii="Calibri" w:hAnsi="Calibri"/>
+          <w:sz w:val="22"/>
+        </w:rPr>
+        <w:t>Reward computation methods</w:t>
+      </w:r>
+    </w:p>
+    <w:p>
+      <w:pPr>
+        <w:pStyle w:val="ListBullet"/>
+        <w:spacing w:after="60"/>
+      </w:pPr>
+      <w:r>
+        <w:rPr>
+          <w:rFonts w:ascii="Calibri" w:hAnsi="Calibri"/>
+          <w:sz w:val="22"/>
+        </w:rPr>
+        <w:t>Eligibility rules</w:t>
+      </w:r>
+    </w:p>
+    <w:p>
+      <w:pPr>
+        <w:pStyle w:val="ListBullet"/>
+        <w:spacing w:after="60"/>
+      </w:pPr>
+      <w:r>
+        <w:rPr>
+          <w:rFonts w:ascii="Calibri" w:hAnsi="Calibri"/>
+          <w:sz w:val="22"/>
+        </w:rPr>
+        <w:t>Developer onboarding requirements</w:t>
+      </w:r>
+    </w:p>
+    <w:p/>
+    <w:p>
+      <w:pPr>
+        <w:spacing w:after="160"/>
+      </w:pPr>
+      <w:r>
+        <w:rPr>
+          <w:rFonts w:ascii="Calibri" w:hAnsi="Calibri"/>
+          <w:sz w:val="22"/>
+        </w:rPr>
+        <w:t>Any future updates or enhancements would be submitted through separate proposals.</w:t>
+      </w:r>
+    </w:p>
+    <w:p>
+      <w:pPr>
+        <w:spacing w:before="240" w:after="80"/>
+      </w:pPr>
+      <w:r>
+        <w:rPr>
+          <w:rFonts w:ascii="Calibri" w:hAnsi="Calibri"/>
+          <w:b/>
+          <w:color w:val="1B3A6B"/>
+          <w:sz w:val="26"/>
+        </w:rPr>
+        <w:t>Benefits</w:t>
+      </w:r>
+    </w:p>
+    <w:p>
+      <w:pPr>
+        <w:pStyle w:val="ListBullet"/>
+        <w:spacing w:after="60"/>
+      </w:pPr>
+      <w:r>
+        <w:rPr>
+          <w:rFonts w:ascii="Calibri" w:hAnsi="Calibri"/>
+          <w:sz w:val="22"/>
+        </w:rPr>
+        <w:t>Rewards genuine activity instead of fee cycling</w:t>
+      </w:r>
+    </w:p>
+    <w:p>
+      <w:pPr>
+        <w:pStyle w:val="ListBullet"/>
+        <w:spacing w:after="60"/>
+      </w:pPr>
+      <w:r>
+        <w:rPr>
+          <w:rFonts w:ascii="Calibri" w:hAnsi="Calibri"/>
+          <w:sz w:val="22"/>
+        </w:rPr>
+        <w:t>Preserves all existing TANIP-1 infrastructure</w:t>
+      </w:r>
+    </w:p>
+    <w:p>
+      <w:pPr>
+        <w:pStyle w:val="ListBullet"/>
+        <w:spacing w:after="60"/>
+      </w:pPr>
+      <w:r>
+        <w:rPr>
+          <w:rFonts w:ascii="Calibri" w:hAnsi="Calibri"/>
+          <w:sz w:val="22"/>
+        </w:rPr>
+        <w:t>Protects treasury resources</w:t>
+      </w:r>
+    </w:p>
+    <w:p>
+      <w:pPr>
+        <w:pStyle w:val="ListBullet"/>
+        <w:spacing w:after="60"/>
+      </w:pPr>
+      <w:r>
+        <w:rPr>
+          <w:rFonts w:ascii="Calibri" w:hAnsi="Calibri"/>
+          <w:sz w:val="22"/>
+        </w:rPr>
+        <w:t>Removes mercenary incentives</w:t>
+      </w:r>
+    </w:p>
+    <w:p>
+      <w:pPr>
+        <w:pStyle w:val="ListBullet"/>
+        <w:spacing w:after="60"/>
+      </w:pPr>
+      <w:r>
+        <w:rPr>
+          <w:rFonts w:ascii="Calibri" w:hAnsi="Calibri"/>
+          <w:sz w:val="22"/>
+        </w:rPr>
+        <w:t>Scales cleanly with the network</w:t>
+      </w:r>
+    </w:p>
+    <w:p>
+      <w:pPr>
+        <w:pStyle w:val="ListBullet"/>
+        <w:spacing w:after="60"/>
+      </w:pPr>
+      <w:r>
+        <w:rPr>
+          <w:rFonts w:ascii="Calibri" w:hAnsi="Calibri"/>
+          <w:sz w:val="22"/>
+        </w:rPr>
+        <w:t>Keeps TAN's ecosystem user-owned and transparent</w:t>
+      </w:r>
+    </w:p>
+    <w:p>
+      <w:pPr>
+        <w:pStyle w:val="ListBullet"/>
+        <w:spacing w:after="60"/>
+      </w:pPr>
+      <w:r>
+        <w:rPr>
+          <w:rFonts w:ascii="Calibri" w:hAnsi="Calibri"/>
+          <w:sz w:val="22"/>
+        </w:rPr>
+        <w:t>Provides a better foundation for future issuance programs</w:t>
+      </w:r>
+    </w:p>
+    <w:p>
+      <w:pPr>
+        <w:spacing w:before="240" w:after="80"/>
+      </w:pPr>
+      <w:r>
+        <w:rPr>
+          <w:rFonts w:ascii="Calibri" w:hAnsi="Calibri"/>
+          <w:b/>
+          <w:color w:val="1B3A6B"/>
+          <w:sz w:val="26"/>
+        </w:rPr>
+        <w:t>Implementation</w:t>
+      </w:r>
+    </w:p>
+    <w:p>
+      <w:pPr>
+        <w:spacing w:after="160"/>
+      </w:pPr>
+      <w:r>
+        <w:rPr>
+          <w:rFonts w:ascii="Calibri" w:hAnsi="Calibri"/>
+          <w:sz w:val="22"/>
+        </w:rPr>
+        <w:t>The TAN Council will work with Telcoin Autonomous Ops LTD. (TAO) to update the TAN issuance off chain script, migrating to the rebate system described above.</w:t>
+      </w:r>
+    </w:p>
+    <w:p>
+      <w:pPr>
+        <w:spacing w:after="160"/>
+      </w:pPr>
+      <w:r>
+        <w:rPr>
+          <w:rFonts w:ascii="Calibri" w:hAnsi="Calibri"/>
+          <w:sz w:val="22"/>
+        </w:rPr>
+        <w:t xml:space="preserve">The existing </w:t>
+      </w:r>
+      <w:r>
+        <w:rPr>
+          <w:rFonts w:ascii="Courier New" w:hAnsi="Courier New"/>
+          <w:sz w:val="20"/>
+        </w:rPr>
+        <w:t>TANIssuanceHistory</w:t>
+      </w:r>
+      <w:r>
+        <w:rPr>
+          <w:rFonts w:ascii="Calibri" w:hAnsi="Calibri"/>
+          <w:sz w:val="22"/>
+        </w:rPr>
+        <w:t xml:space="preserve"> contract will be reused, preserving each wallet's full issuance history from the original TANIP-1 implementation. To bring the contract's period index up to date following the pause, one or more periods with zero distributions will be submitted, covering the weeks in which the program was inactive. This advances the contract state without crediting any rewards or altering any accumulated balances.</w:t>
+      </w:r>
+    </w:p>
+    <w:p>
+      <w:pPr>
+        <w:spacing w:after="160"/>
+      </w:pPr>
+      <w:r>
+        <w:rPr>
+          <w:rFonts w:ascii="Calibri" w:hAnsi="Calibri"/>
+          <w:sz w:val="22"/>
+        </w:rPr>
+        <w:t>This approach was tested end-to-end prior to this proposal. The contract accepts zero-value period inputs without error, the off chain script handles them correctly, and subsequent live distribution periods process accurately after the bridge.</w:t>
+      </w:r>
+    </w:p>
+    <w:p>
+      <w:pPr>
+        <w:spacing w:before="240" w:after="80"/>
+      </w:pPr>
+      <w:r>
+        <w:rPr>
+          <w:rFonts w:ascii="Calibri" w:hAnsi="Calibri"/>
+          <w:b/>
+          <w:color w:val="1B3A6B"/>
+          <w:sz w:val="26"/>
+        </w:rPr>
+        <w:t>Conclusion</w:t>
+      </w:r>
+    </w:p>
+    <w:p>
+      <w:pPr>
+        <w:spacing w:after="160"/>
+      </w:pPr>
+      <w:r>
+        <w:rPr>
+          <w:rFonts w:ascii="Calibri" w:hAnsi="Calibri"/>
+          <w:sz w:val="22"/>
+        </w:rPr>
+        <w:t>TANIP-1 proved the model and gave the ecosystem valuable data. The rebate program is the logical next step. It maintains user incentives, improves fairness, and positions TAN for sustainable adoption as more developers and users join the network.</w:t>
+      </w:r>
+    </w:p>
+    <w:p>
+      <w:pPr>
+        <w:spacing w:after="160"/>
+      </w:pPr>
+      <w:r>
+        <w:rPr>
+          <w:rFonts w:ascii="Calibri" w:hAnsi="Calibri"/>
+          <w:sz w:val="22"/>
+        </w:rPr>
+        <w:t>The Council invites the community to support this proposal and move TAN application layer incentives into their next phase.</w:t>
       </w:r>
     </w:p>
     <w:sectPr>

</xml_diff>

<commit_message>
Clarify two-cap calculation in rebate formula section
Splits formula into Step 1 (TANIP-1 stake cap, unchanged) and Step 2
(new fee cap), making explicit that both caps apply sequentially.
Updates Implementation to link preserved lifetime earned back to
the stake cap in Step 1.

https://claude.ai/code/session_016mQ9whgNKKGDXRPfCYPFhA
</commit_message>
<xml_diff>
--- a/proposals/TANIP-1-Amendment-I.docx
+++ b/proposals/TANIP-1-Amendment-I.docx
@@ -5,7 +5,6 @@
     <w:p>
       <w:pPr>
         <w:spacing w:after="80"/>
-        <w:jc w:val="left"/>
       </w:pPr>
       <w:r>
         <w:rPr>
@@ -428,29 +427,93 @@
     </w:p>
     <w:p>
       <w:pPr>
-        <w:spacing w:before="80" w:after="160"/>
-        <w:ind w:left="567"/>
-        <w:shd w:val="clear" w:color="auto" w:fill="F0F0F0"/>
+        <w:spacing w:after="80"/>
       </w:pPr>
       <w:r>
         <w:rPr>
-          <w:rFonts w:ascii="Courier New" w:hAnsi="Courier New"/>
-          <w:sz w:val="19"/>
+          <w:rFonts w:ascii="Calibri" w:hAnsi="Calibri"/>
+          <w:sz w:val="22"/>
         </w:rPr>
-        <w:t>R = calculated issuance from own and referee fees</w:t>
-        <w:br/>
-        <w:t xml:space="preserve">    (following same calculation as original TANIP-1 implementation)</w:t>
-        <w:br/>
-        <w:br/>
+        <w:t>The calculation applies two sequential caps:</w:t>
+      </w:r>
+    </w:p>
+    <w:p>
+      <w:pPr>
+        <w:spacing w:after="40"/>
+      </w:pPr>
+      <w:r>
+        <w:rPr>
+          <w:rFonts w:ascii="Calibri" w:hAnsi="Calibri"/>
+          <w:b/>
+          <w:sz w:val="22"/>
+        </w:rPr>
+        <w:t>Step 1 — Calculate issuance (unchanged from TANIP-1)</w:t>
+      </w:r>
+    </w:p>
+    <w:p>
+      <w:pPr>
+        <w:spacing w:after="160"/>
+      </w:pPr>
+      <w:r>
+        <w:rPr>
+          <w:rFonts w:ascii="Calibri" w:hAnsi="Calibri"/>
+          <w:sz w:val="22"/>
+        </w:rPr>
+        <w:t>R = pro-rata share of the weekly allocation based on own and referee fees, capped by the wallet's remaining stake allowance (time-weighted average stake minus total lifetime earned)</w:t>
+      </w:r>
+    </w:p>
+    <w:p>
+      <w:pPr>
+        <w:spacing w:after="40"/>
+      </w:pPr>
+      <w:r>
+        <w:rPr>
+          <w:rFonts w:ascii="Calibri" w:hAnsi="Calibri"/>
+          <w:b/>
+          <w:sz w:val="22"/>
+        </w:rPr>
+        <w:t>Step 2 — Apply rebate cap (new)</w:t>
+      </w:r>
+    </w:p>
+    <w:p>
+      <w:pPr>
+        <w:spacing w:after="40"/>
+      </w:pPr>
+      <w:r>
+        <w:rPr>
+          <w:rFonts w:ascii="Calibri" w:hAnsi="Calibri"/>
+          <w:sz w:val="22"/>
+        </w:rPr>
         <w:t>F = total TEL fees paid by the wallet during the period</w:t>
-        <w:br/>
-        <w:br/>
+      </w:r>
+    </w:p>
+    <w:p>
+      <w:pPr>
+        <w:spacing w:after="160"/>
+      </w:pPr>
+      <w:r>
+        <w:rPr>
+          <w:rFonts w:ascii="Calibri" w:hAnsi="Calibri"/>
+          <w:sz w:val="22"/>
+        </w:rPr>
         <w:t>Final rebate = min(R, F)</w:t>
       </w:r>
     </w:p>
     <w:p>
       <w:pPr>
-        <w:spacing w:after="80"/>
+        <w:spacing w:after="160"/>
+      </w:pPr>
+      <w:r>
+        <w:rPr>
+          <w:rFonts w:ascii="Calibri" w:hAnsi="Calibri"/>
+          <w:sz w:val="22"/>
+        </w:rPr>
+        <w:t>The only change from the original TANIP-1 implementation is Step 2. Step 1 is identical to how rewards were calculated previously.</w:t>
+      </w:r>
+    </w:p>
+    <w:p>
+      <w:pPr>
+        <w:spacing w:after="40"/>
       </w:pPr>
       <w:r>
         <w:rPr>
@@ -470,7 +533,7 @@
           <w:rFonts w:ascii="Calibri" w:hAnsi="Calibri"/>
           <w:sz w:val="22"/>
         </w:rPr>
-        <w:t>If the calculated rebate exceeds the wallet's fee spending, the wallet receives back the amount it paid in fees.</w:t>
+        <w:t>If R is lower than F: the wallet receives the full calculated rebate, as it spent more in fees than it earned back.</w:t>
       </w:r>
     </w:p>
     <w:p>
@@ -482,7 +545,7 @@
           <w:rFonts w:ascii="Calibri" w:hAnsi="Calibri"/>
           <w:sz w:val="22"/>
         </w:rPr>
-        <w:t>If the calculated rebate is lower than the wallet's fee spending, the wallet receives the full rebate.</w:t>
+        <w:t>If R is higher than F: the wallet receives back what it paid in fees and no more. It cannot profit from the program.</w:t>
       </w:r>
     </w:p>
     <w:p>
@@ -494,7 +557,7 @@
           <w:rFonts w:ascii="Calibri" w:hAnsi="Calibri"/>
           <w:sz w:val="22"/>
         </w:rPr>
-        <w:t>This ensures no participant can earn more TEL than they spend, removing the main driver of mercenary volume.</w:t>
+        <w:t>Both caps must be satisfied. The stake cap in Step 1 prevents rewards from exceeding a wallet's proportional stake. The fee cap in Step 2 then ensures no wallet earns more TEL than it spent.</w:t>
       </w:r>
     </w:p>
     <w:p>
@@ -846,7 +909,7 @@
           <w:rFonts w:ascii="Calibri" w:hAnsi="Calibri"/>
           <w:sz w:val="22"/>
         </w:rPr>
-        <w:t>Preserves all existing TANIP-1 infrastructure</w:t>
+        <w:t>Preserves all existing TANIP-1 infrastructure and user histories</w:t>
       </w:r>
     </w:p>
     <w:p>
@@ -964,6 +1027,18 @@
           <w:sz w:val="22"/>
         </w:rPr>
         <w:t xml:space="preserve"> contract will be reused, preserving each wallet's full issuance history from the original TANIP-1 implementation. To bring the contract's period index up to date following the pause, one or more periods with zero distributions will be submitted, covering the weeks in which the program was inactive. This advances the contract state without crediting any rewards or altering any accumulated balances.</w:t>
+      </w:r>
+    </w:p>
+    <w:p>
+      <w:pPr>
+        <w:spacing w:after="160"/>
+      </w:pPr>
+      <w:r>
+        <w:rPr>
+          <w:rFonts w:ascii="Calibri" w:hAnsi="Calibri"/>
+          <w:sz w:val="22"/>
+        </w:rPr>
+        <w:t>Because each wallet's total lifetime earned is preserved, the stake cap in Step 1 resumes correctly from where it left off. No wallet receives an artificially inflated allowance on relaunch.</w:t>
       </w:r>
     </w:p>
     <w:p>

</xml_diff>